<commit_message>
Cambios al TO DO
</commit_message>
<xml_diff>
--- a/To DO del Proyecto.docx
+++ b/To DO del Proyecto.docx
@@ -47,6 +47,18 @@
       </w:pPr>
       <w:r>
         <w:rPr/>
+        <w:t>habilitar el control de los Email en supabase</w:t>
+      </w:r>
+    </w:p>
+    <w:p>
+      <w:pPr>
+        <w:pStyle w:val="Normal"/>
+        <w:bidi w:val="0"/>
+        <w:jc w:val="left"/>
+        <w:rPr/>
+      </w:pPr>
+      <w:r>
+        <w:rPr/>
       </w:r>
     </w:p>
     <w:p>
@@ -81,29 +93,6 @@
       </w:pPr>
       <w:r>
         <w:rPr/>
-        <w:t>Hacer funcionar los modulos de clientes (Motorizados) y locales</w:t>
-      </w:r>
-    </w:p>
-    <w:p>
-      <w:pPr>
-        <w:pStyle w:val="Normal"/>
-        <w:bidi w:val="0"/>
-        <w:jc w:val="left"/>
-        <w:rPr/>
-      </w:pPr>
-      <w:r>
-        <w:rPr/>
-      </w:r>
-    </w:p>
-    <w:p>
-      <w:pPr>
-        <w:pStyle w:val="Normal"/>
-        <w:bidi w:val="0"/>
-        <w:jc w:val="left"/>
-        <w:rPr/>
-      </w:pPr>
-      <w:r>
-        <w:rPr/>
         <w:t>Convertir a APK con Android Movile (SDK , tooltip)</w:t>
       </w:r>
     </w:p>
@@ -127,34 +116,7 @@
       </w:pPr>
       <w:r>
         <w:rPr/>
-        <w:t xml:space="preserve">Pestaña de Emergencia </w:t>
-      </w:r>
-      <w:r>
-        <w:rPr/>
-        <w:t>funcional</w:t>
-      </w:r>
-    </w:p>
-    <w:p>
-      <w:pPr>
-        <w:pStyle w:val="Normal"/>
-        <w:bidi w:val="0"/>
-        <w:jc w:val="left"/>
-        <w:rPr/>
-      </w:pPr>
-      <w:r>
-        <w:rPr/>
-      </w:r>
-    </w:p>
-    <w:p>
-      <w:pPr>
-        <w:pStyle w:val="Normal"/>
-        <w:bidi w:val="0"/>
-        <w:jc w:val="left"/>
-        <w:rPr/>
-      </w:pPr>
-      <w:r>
-        <w:rPr/>
-        <w:t>Implementar API de la IA</w:t>
+        <w:t>Agregar contexto de supabase a la IA</w:t>
       </w:r>
     </w:p>
     <w:p>
@@ -246,18 +208,145 @@
       </w:pPr>
       <w:r>
         <w:rPr/>
-      </w:r>
-    </w:p>
-    <w:p>
-      <w:pPr>
-        <w:pStyle w:val="Normal"/>
-        <w:bidi w:val="0"/>
-        <w:jc w:val="left"/>
-        <w:rPr/>
-      </w:pPr>
-      <w:r>
-        <w:rPr/>
-        <w:t>Hacer que aparezcan los descuentos en la vista de motorizados según la moto que tengan y si son compatibles</w:t>
+        <w:t>Corregir la vista admin para que puede operar correctamente (hacer  la plantilla),</w:t>
+        <w:br/>
+        <w:t>Pestañas:</w:t>
+      </w:r>
+    </w:p>
+    <w:p>
+      <w:pPr>
+        <w:pStyle w:val="Normal"/>
+        <w:bidi w:val="0"/>
+        <w:jc w:val="left"/>
+        <w:rPr/>
+      </w:pPr>
+      <w:r>
+        <w:rPr/>
+      </w:r>
+    </w:p>
+    <w:p>
+      <w:pPr>
+        <w:pStyle w:val="Normal"/>
+        <w:bidi w:val="0"/>
+        <w:jc w:val="left"/>
+        <w:rPr/>
+      </w:pPr>
+      <w:r>
+        <w:rPr/>
+        <w:t>*</w:t>
+      </w:r>
+      <w:r>
+        <w:rPr/>
+        <w:t>Inicio: Panel de control y estadisticas</w:t>
+      </w:r>
+    </w:p>
+    <w:p>
+      <w:pPr>
+        <w:pStyle w:val="Normal"/>
+        <w:bidi w:val="0"/>
+        <w:jc w:val="left"/>
+        <w:rPr/>
+      </w:pPr>
+      <w:r>
+        <w:rPr/>
+        <w:t>*Mapa Global: con la ubicación de los locales registrados</w:t>
+      </w:r>
+    </w:p>
+    <w:p>
+      <w:pPr>
+        <w:pStyle w:val="Normal"/>
+        <w:bidi w:val="0"/>
+        <w:jc w:val="left"/>
+        <w:rPr/>
+      </w:pPr>
+      <w:r>
+        <w:rPr/>
+        <w:t>*Gestion de Usuarios: CRUD completo. : Nombres de usuarios, correos, Rol, bloquear,cambiar rol, desbloquear, membresia.</w:t>
+      </w:r>
+    </w:p>
+    <w:p>
+      <w:pPr>
+        <w:pStyle w:val="Normal"/>
+        <w:bidi w:val="0"/>
+        <w:jc w:val="left"/>
+        <w:rPr/>
+      </w:pPr>
+      <w:r>
+        <w:rPr/>
+        <w:t>*Cursos: Aquí se ven los cursos (Nombre y foto), se habilitan o deshabilitan y modificar a la membresia que deben pertenecer.</w:t>
+      </w:r>
+    </w:p>
+    <w:p>
+      <w:pPr>
+        <w:pStyle w:val="Normal"/>
+        <w:bidi w:val="0"/>
+        <w:jc w:val="left"/>
+        <w:rPr/>
+      </w:pPr>
+      <w:r>
+        <w:rPr/>
+        <w:t>*Solicitudes de grupo: que aparezcan los datos de quien solicita y el nombre del grupo</w:t>
+      </w:r>
+    </w:p>
+    <w:p>
+      <w:pPr>
+        <w:pStyle w:val="Normal"/>
+        <w:bidi w:val="0"/>
+        <w:jc w:val="left"/>
+        <w:rPr/>
+      </w:pPr>
+      <w:r>
+        <w:rPr/>
+        <w:t xml:space="preserve">*Registro De pagos: </w:t>
+      </w:r>
+      <w:r>
+        <w:rPr/>
+        <w:t>Aqui hay que ver como hacemos si con nombre de usuario y un check o confirmar el pago con un boton.</w:t>
+      </w:r>
+    </w:p>
+    <w:p>
+      <w:pPr>
+        <w:pStyle w:val="Normal"/>
+        <w:bidi w:val="0"/>
+        <w:jc w:val="left"/>
+        <w:rPr/>
+      </w:pPr>
+      <w:r>
+        <w:rPr/>
+      </w:r>
+    </w:p>
+    <w:p>
+      <w:pPr>
+        <w:pStyle w:val="Normal"/>
+        <w:bidi w:val="0"/>
+        <w:jc w:val="left"/>
+        <w:rPr/>
+      </w:pPr>
+      <w:r>
+        <w:rPr/>
+        <w:t>Ajustar que todos los campos y registro de productos concuerden con la BD</w:t>
+      </w:r>
+    </w:p>
+    <w:p>
+      <w:pPr>
+        <w:pStyle w:val="Normal"/>
+        <w:bidi w:val="0"/>
+        <w:jc w:val="left"/>
+        <w:rPr/>
+      </w:pPr>
+      <w:r>
+        <w:rPr/>
+      </w:r>
+    </w:p>
+    <w:p>
+      <w:pPr>
+        <w:pStyle w:val="Normal"/>
+        <w:bidi w:val="0"/>
+        <w:jc w:val="left"/>
+        <w:rPr/>
+      </w:pPr>
+      <w:r>
+        <w:rPr/>
       </w:r>
     </w:p>
     <w:p>
@@ -375,7 +464,7 @@
     <w:pPr>
       <w:widowControl/>
       <w:suppressAutoHyphens w:val="true"/>
-      <w:overflowPunct w:val="false"/>
+      <w:overflowPunct w:val="true"/>
       <w:bidi w:val="0"/>
       <w:spacing w:before="0" w:after="0"/>
       <w:jc w:val="left"/>

</xml_diff>

<commit_message>
TO DO ACTUALIZADO SEMANA FINAL
</commit_message>
<xml_diff>
--- a/To DO del Proyecto.docx
+++ b/To DO del Proyecto.docx
@@ -23,7 +23,804 @@
       <w:r>
         <w:rPr/>
         <w:t>Prioridad:</w:t>
+      </w:r>
+    </w:p>
+    <w:p>
+      <w:pPr>
+        <w:pStyle w:val="Normal"/>
+        <w:bidi w:val="0"/>
+        <w:jc w:val="left"/>
+        <w:rPr/>
+      </w:pPr>
+      <w:r>
+        <w:rPr/>
+      </w:r>
+    </w:p>
+    <w:p>
+      <w:pPr>
+        <w:pStyle w:val="Normal"/>
+        <w:bidi w:val="0"/>
+        <w:jc w:val="left"/>
+        <w:rPr/>
+      </w:pPr>
+      <w:r>
+        <w:rPr/>
+        <w:t>VISUAL:</w:t>
+      </w:r>
+    </w:p>
+    <w:p>
+      <w:pPr>
+        <w:pStyle w:val="Normal"/>
+        <w:bidi w:val="0"/>
+        <w:jc w:val="left"/>
+        <w:rPr/>
+      </w:pPr>
+      <w:r>
+        <w:rPr/>
+      </w:r>
+    </w:p>
+    <w:p>
+      <w:pPr>
+        <w:pStyle w:val="Normal"/>
+        <w:bidi w:val="0"/>
+        <w:jc w:val="left"/>
+        <w:rPr/>
+      </w:pPr>
+      <w:r>
+        <w:rPr>
+          <w:lang w:val="es-MX"/>
+        </w:rPr>
+        <w:t>1.</w:t>
+      </w:r>
+      <w:r>
+        <w:rPr/>
+        <w:t>Acomodar las comunidades de moteros :</w:t>
+      </w:r>
+      <w:r>
+        <w:rPr/>
         <w:br/>
+        <w:br/>
+        <w:t>Datos que necesita el dueño del grupo:</w:t>
+        <w:br/>
+        <w:t>-feedback visual que su solicitud está en espera.</w:t>
+      </w:r>
+    </w:p>
+    <w:p>
+      <w:pPr>
+        <w:pStyle w:val="Normal"/>
+        <w:bidi w:val="0"/>
+        <w:jc w:val="left"/>
+        <w:rPr/>
+      </w:pPr>
+      <w:r>
+        <w:rPr/>
+        <w:t>-</w:t>
+      </w:r>
+      <w:r>
+        <w:rPr/>
+        <w:t>Nombre, Telfono, cedula (Ya están)</w:t>
+      </w:r>
+    </w:p>
+    <w:p>
+      <w:pPr>
+        <w:pStyle w:val="Normal"/>
+        <w:bidi w:val="0"/>
+        <w:jc w:val="left"/>
+        <w:rPr/>
+      </w:pPr>
+      <w:r>
+        <w:rPr>
+          <w:lang w:val="es-MX"/>
+        </w:rPr>
+        <w:t>*</w:t>
+      </w:r>
+      <w:r>
+        <w:rPr/>
+        <w:t>Nombre del Grupo.</w:t>
+        <w:br/>
+      </w:r>
+      <w:r>
+        <w:rPr>
+          <w:lang w:val="es-MX"/>
+        </w:rPr>
+        <w:t xml:space="preserve">*Zona a la que pertenece (Ver si Se puede usar </w:t>
+      </w:r>
+      <w:r>
+        <w:rPr>
+          <w:lang w:val="es-MX"/>
+        </w:rPr>
+        <w:t>un</w:t>
+      </w:r>
+      <w:r>
+        <w:rPr>
+          <w:lang w:val="es-MX"/>
+        </w:rPr>
+        <w:t xml:space="preserve"> “select” para no forrar la BD de duplicados)</w:t>
+        <w:br/>
+        <w:t>*Ruta.</w:t>
+      </w:r>
+    </w:p>
+    <w:p>
+      <w:pPr>
+        <w:pStyle w:val="Normal"/>
+        <w:bidi w:val="0"/>
+        <w:jc w:val="left"/>
+        <w:rPr>
+          <w:lang w:val="es-MX"/>
+        </w:rPr>
+      </w:pPr>
+      <w:r>
+        <w:rPr>
+          <w:lang w:val="es-MX"/>
+        </w:rPr>
+        <w:t>*Imagen</w:t>
+      </w:r>
+    </w:p>
+    <w:p>
+      <w:pPr>
+        <w:pStyle w:val="Normal"/>
+        <w:bidi w:val="0"/>
+        <w:jc w:val="left"/>
+        <w:rPr/>
+      </w:pPr>
+      <w:r>
+        <w:rPr>
+          <w:lang w:val="es-MX"/>
+        </w:rPr>
+        <w:t>*Redes.</w:t>
+      </w:r>
+    </w:p>
+    <w:p>
+      <w:pPr>
+        <w:pStyle w:val="Normal"/>
+        <w:bidi w:val="0"/>
+        <w:jc w:val="left"/>
+        <w:rPr/>
+      </w:pPr>
+      <w:r>
+        <w:rPr/>
+      </w:r>
+    </w:p>
+    <w:p>
+      <w:pPr>
+        <w:pStyle w:val="Normal"/>
+        <w:bidi w:val="0"/>
+        <w:jc w:val="left"/>
+        <w:rPr/>
+      </w:pPr>
+      <w:r>
+        <w:rPr>
+          <w:lang w:val="es-MX"/>
+        </w:rPr>
+        <w:t>2.</w:t>
+      </w:r>
+      <w:r>
+        <w:rPr>
+          <w:rFonts w:ascii="Liberation Serif" w:hAnsi="Liberation Serif"/>
+          <w:color w:val="000000"/>
+          <w:lang w:val="es-MX"/>
+        </w:rPr>
+        <w:t xml:space="preserve">Ajustar </w:t>
+      </w:r>
+      <w:r>
+        <w:rPr>
+          <w:rFonts w:ascii="Liberation Serif" w:hAnsi="Liberation Serif"/>
+          <w:color w:val="000000"/>
+          <w:lang w:val="es-MX"/>
+        </w:rPr>
+        <w:t xml:space="preserve">la </w:t>
+      </w:r>
+      <w:r>
+        <w:rPr>
+          <w:rStyle w:val="Strong"/>
+          <w:rFonts w:ascii="Liberation Serif" w:hAnsi="Liberation Serif"/>
+          <w:b w:val="false"/>
+          <w:i w:val="false"/>
+          <w:caps w:val="false"/>
+          <w:smallCaps w:val="false"/>
+          <w:color w:val="000000"/>
+          <w:spacing w:val="0"/>
+          <w:sz w:val="24"/>
+        </w:rPr>
+        <w:t>Tarjeta de Información de Negocio</w:t>
+      </w:r>
+      <w:r>
+        <w:rPr>
+          <w:rFonts w:ascii="Liberation Serif" w:hAnsi="Liberation Serif"/>
+          <w:color w:val="000000"/>
+        </w:rPr>
+        <w:drawing>
+          <wp:anchor behindDoc="0" distT="0" distB="0" distL="0" distR="0" simplePos="0" locked="0" layoutInCell="0" allowOverlap="1" relativeHeight="2">
+            <wp:simplePos x="0" y="0"/>
+            <wp:positionH relativeFrom="column">
+              <wp:posOffset>0</wp:posOffset>
+            </wp:positionH>
+            <wp:positionV relativeFrom="paragraph">
+              <wp:posOffset>322580</wp:posOffset>
+            </wp:positionV>
+            <wp:extent cx="6332220" cy="4400550"/>
+            <wp:effectExtent l="0" t="0" r="0" b="0"/>
+            <wp:wrapSquare wrapText="largest"/>
+            <wp:docPr id="1" name="Imagen1"/>
+            <wp:cNvGraphicFramePr>
+              <a:graphicFrameLocks xmlns:a="http://schemas.openxmlformats.org/drawingml/2006/main" noChangeAspect="1"/>
+            </wp:cNvGraphicFramePr>
+            <a:graphic xmlns:a="http://schemas.openxmlformats.org/drawingml/2006/main">
+              <a:graphicData uri="http://schemas.openxmlformats.org/drawingml/2006/picture">
+                <pic:pic xmlns:pic="http://schemas.openxmlformats.org/drawingml/2006/picture">
+                  <pic:nvPicPr>
+                    <pic:cNvPr id="1" name="Imagen1"/>
+                    <pic:cNvPicPr>
+                      <a:picLocks noChangeAspect="1" noChangeArrowheads="1"/>
+                    </pic:cNvPicPr>
+                  </pic:nvPicPr>
+                  <pic:blipFill>
+                    <a:blip r:embed="rId2"/>
+                    <a:stretch>
+                      <a:fillRect/>
+                    </a:stretch>
+                  </pic:blipFill>
+                  <pic:spPr bwMode="auto">
+                    <a:xfrm>
+                      <a:off x="0" y="0"/>
+                      <a:ext cx="6332220" cy="4400550"/>
+                    </a:xfrm>
+                    <a:prstGeom prst="rect">
+                      <a:avLst/>
+                    </a:prstGeom>
+                    <a:noFill/>
+                  </pic:spPr>
+                </pic:pic>
+              </a:graphicData>
+            </a:graphic>
+          </wp:anchor>
+        </w:drawing>
+      </w:r>
+      <w:r>
+        <w:rPr>
+          <w:rFonts w:ascii="Liberation Serif" w:hAnsi="Liberation Serif"/>
+          <w:color w:val="000000"/>
+        </w:rPr>
+        <w:t xml:space="preserve"> :</w:t>
+        <w:br/>
+      </w:r>
+    </w:p>
+    <w:p>
+      <w:pPr>
+        <w:pStyle w:val="Normal"/>
+        <w:bidi w:val="0"/>
+        <w:jc w:val="left"/>
+        <w:rPr>
+          <w:lang w:val="es-MX"/>
+        </w:rPr>
+      </w:pPr>
+      <w:r>
+        <w:rPr>
+          <w:lang w:val="es-MX"/>
+        </w:rPr>
+        <w:t>IMAGEN DE EJEMPLO.</w:t>
+      </w:r>
+    </w:p>
+    <w:p>
+      <w:pPr>
+        <w:pStyle w:val="Normal"/>
+        <w:bidi w:val="0"/>
+        <w:jc w:val="left"/>
+        <w:rPr>
+          <w:lang w:val="es-MX"/>
+        </w:rPr>
+      </w:pPr>
+      <w:r>
+        <w:rPr>
+          <w:lang w:val="es-MX"/>
+        </w:rPr>
+      </w:r>
+    </w:p>
+    <w:p>
+      <w:pPr>
+        <w:pStyle w:val="Normal"/>
+        <w:bidi w:val="0"/>
+        <w:jc w:val="left"/>
+        <w:rPr>
+          <w:lang w:val="es-MX"/>
+        </w:rPr>
+      </w:pPr>
+      <w:r>
+        <w:rPr>
+          <w:lang w:val="es-MX"/>
+        </w:rPr>
+      </w:r>
+    </w:p>
+    <w:p>
+      <w:pPr>
+        <w:pStyle w:val="Normal"/>
+        <w:bidi w:val="0"/>
+        <w:jc w:val="left"/>
+        <w:rPr>
+          <w:lang w:val="es-MX"/>
+        </w:rPr>
+      </w:pPr>
+      <w:r>
+        <w:rPr>
+          <w:lang w:val="es-MX"/>
+        </w:rPr>
+      </w:r>
+    </w:p>
+    <w:p>
+      <w:pPr>
+        <w:pStyle w:val="Normal"/>
+        <w:bidi w:val="0"/>
+        <w:jc w:val="left"/>
+        <w:rPr>
+          <w:lang w:val="es-MX"/>
+        </w:rPr>
+      </w:pPr>
+      <w:r>
+        <w:rPr>
+          <w:lang w:val="es-MX"/>
+        </w:rPr>
+      </w:r>
+    </w:p>
+    <w:p>
+      <w:pPr>
+        <w:pStyle w:val="Normal"/>
+        <w:bidi w:val="0"/>
+        <w:jc w:val="left"/>
+        <w:rPr/>
+      </w:pPr>
+      <w:r>
+        <w:rPr/>
+        <w:drawing>
+          <wp:anchor behindDoc="0" distT="0" distB="0" distL="0" distR="0" simplePos="0" locked="0" layoutInCell="0" allowOverlap="1" relativeHeight="3">
+            <wp:simplePos x="0" y="0"/>
+            <wp:positionH relativeFrom="column">
+              <wp:posOffset>922655</wp:posOffset>
+            </wp:positionH>
+            <wp:positionV relativeFrom="paragraph">
+              <wp:posOffset>-138430</wp:posOffset>
+            </wp:positionV>
+            <wp:extent cx="3994785" cy="3422015"/>
+            <wp:effectExtent l="0" t="0" r="0" b="0"/>
+            <wp:wrapSquare wrapText="largest"/>
+            <wp:docPr id="2" name="Imagen2"/>
+            <wp:cNvGraphicFramePr>
+              <a:graphicFrameLocks xmlns:a="http://schemas.openxmlformats.org/drawingml/2006/main" noChangeAspect="1"/>
+            </wp:cNvGraphicFramePr>
+            <a:graphic xmlns:a="http://schemas.openxmlformats.org/drawingml/2006/main">
+              <a:graphicData uri="http://schemas.openxmlformats.org/drawingml/2006/picture">
+                <pic:pic xmlns:pic="http://schemas.openxmlformats.org/drawingml/2006/picture">
+                  <pic:nvPicPr>
+                    <pic:cNvPr id="2" name="Imagen2"/>
+                    <pic:cNvPicPr>
+                      <a:picLocks noChangeAspect="1" noChangeArrowheads="1"/>
+                    </pic:cNvPicPr>
+                  </pic:nvPicPr>
+                  <pic:blipFill>
+                    <a:blip r:embed="rId3"/>
+                    <a:stretch>
+                      <a:fillRect/>
+                    </a:stretch>
+                  </pic:blipFill>
+                  <pic:spPr bwMode="auto">
+                    <a:xfrm>
+                      <a:off x="0" y="0"/>
+                      <a:ext cx="3994785" cy="3422015"/>
+                    </a:xfrm>
+                    <a:prstGeom prst="rect">
+                      <a:avLst/>
+                    </a:prstGeom>
+                    <a:noFill/>
+                  </pic:spPr>
+                </pic:pic>
+              </a:graphicData>
+            </a:graphic>
+          </wp:anchor>
+        </w:drawing>
+      </w:r>
+    </w:p>
+    <w:p>
+      <w:pPr>
+        <w:pStyle w:val="Normal"/>
+        <w:bidi w:val="0"/>
+        <w:jc w:val="left"/>
+        <w:rPr/>
+      </w:pPr>
+      <w:r>
+        <w:rPr/>
+      </w:r>
+    </w:p>
+    <w:p>
+      <w:pPr>
+        <w:pStyle w:val="Normal"/>
+        <w:bidi w:val="0"/>
+        <w:jc w:val="left"/>
+        <w:rPr/>
+      </w:pPr>
+      <w:r>
+        <w:rPr/>
+      </w:r>
+    </w:p>
+    <w:p>
+      <w:pPr>
+        <w:pStyle w:val="Normal"/>
+        <w:bidi w:val="0"/>
+        <w:jc w:val="left"/>
+        <w:rPr/>
+      </w:pPr>
+      <w:r>
+        <w:rPr/>
+      </w:r>
+    </w:p>
+    <w:p>
+      <w:pPr>
+        <w:pStyle w:val="Normal"/>
+        <w:bidi w:val="0"/>
+        <w:jc w:val="left"/>
+        <w:rPr/>
+      </w:pPr>
+      <w:r>
+        <w:rPr/>
+      </w:r>
+    </w:p>
+    <w:p>
+      <w:pPr>
+        <w:pStyle w:val="Normal"/>
+        <w:bidi w:val="0"/>
+        <w:jc w:val="left"/>
+        <w:rPr/>
+      </w:pPr>
+      <w:r>
+        <w:rPr/>
+      </w:r>
+    </w:p>
+    <w:p>
+      <w:pPr>
+        <w:pStyle w:val="Normal"/>
+        <w:bidi w:val="0"/>
+        <w:jc w:val="left"/>
+        <w:rPr/>
+      </w:pPr>
+      <w:r>
+        <w:rPr/>
+      </w:r>
+    </w:p>
+    <w:p>
+      <w:pPr>
+        <w:pStyle w:val="Normal"/>
+        <w:bidi w:val="0"/>
+        <w:jc w:val="left"/>
+        <w:rPr/>
+      </w:pPr>
+      <w:r>
+        <w:rPr/>
+      </w:r>
+    </w:p>
+    <w:p>
+      <w:pPr>
+        <w:pStyle w:val="Normal"/>
+        <w:bidi w:val="0"/>
+        <w:jc w:val="left"/>
+        <w:rPr/>
+      </w:pPr>
+      <w:r>
+        <w:rPr/>
+      </w:r>
+    </w:p>
+    <w:p>
+      <w:pPr>
+        <w:pStyle w:val="Normal"/>
+        <w:bidi w:val="0"/>
+        <w:jc w:val="left"/>
+        <w:rPr/>
+      </w:pPr>
+      <w:r>
+        <w:rPr/>
+      </w:r>
+    </w:p>
+    <w:p>
+      <w:pPr>
+        <w:pStyle w:val="Normal"/>
+        <w:bidi w:val="0"/>
+        <w:jc w:val="left"/>
+        <w:rPr/>
+      </w:pPr>
+      <w:r>
+        <w:rPr/>
+      </w:r>
+    </w:p>
+    <w:p>
+      <w:pPr>
+        <w:pStyle w:val="Normal"/>
+        <w:bidi w:val="0"/>
+        <w:jc w:val="left"/>
+        <w:rPr/>
+      </w:pPr>
+      <w:r>
+        <w:rPr/>
+      </w:r>
+    </w:p>
+    <w:p>
+      <w:pPr>
+        <w:pStyle w:val="Normal"/>
+        <w:bidi w:val="0"/>
+        <w:jc w:val="left"/>
+        <w:rPr/>
+      </w:pPr>
+      <w:r>
+        <w:rPr/>
+      </w:r>
+    </w:p>
+    <w:p>
+      <w:pPr>
+        <w:pStyle w:val="Normal"/>
+        <w:bidi w:val="0"/>
+        <w:jc w:val="left"/>
+        <w:rPr/>
+      </w:pPr>
+      <w:r>
+        <w:rPr/>
+      </w:r>
+    </w:p>
+    <w:p>
+      <w:pPr>
+        <w:pStyle w:val="Normal"/>
+        <w:bidi w:val="0"/>
+        <w:jc w:val="left"/>
+        <w:rPr/>
+      </w:pPr>
+      <w:r>
+        <w:rPr/>
+      </w:r>
+    </w:p>
+    <w:p>
+      <w:pPr>
+        <w:pStyle w:val="Normal"/>
+        <w:bidi w:val="0"/>
+        <w:jc w:val="left"/>
+        <w:rPr/>
+      </w:pPr>
+      <w:r>
+        <w:rPr/>
+      </w:r>
+    </w:p>
+    <w:p>
+      <w:pPr>
+        <w:pStyle w:val="Normal"/>
+        <w:bidi w:val="0"/>
+        <w:jc w:val="left"/>
+        <w:rPr/>
+      </w:pPr>
+      <w:r>
+        <w:rPr/>
+      </w:r>
+    </w:p>
+    <w:p>
+      <w:pPr>
+        <w:pStyle w:val="Normal"/>
+        <w:bidi w:val="0"/>
+        <w:jc w:val="left"/>
+        <w:rPr/>
+      </w:pPr>
+      <w:r>
+        <w:rPr/>
+      </w:r>
+    </w:p>
+    <w:p>
+      <w:pPr>
+        <w:pStyle w:val="Normal"/>
+        <w:bidi w:val="0"/>
+        <w:jc w:val="left"/>
+        <w:rPr/>
+      </w:pPr>
+      <w:r>
+        <w:rPr/>
+      </w:r>
+    </w:p>
+    <w:p>
+      <w:pPr>
+        <w:pStyle w:val="Normal"/>
+        <w:bidi w:val="0"/>
+        <w:jc w:val="left"/>
+        <w:rPr/>
+      </w:pPr>
+      <w:r>
+        <w:rPr/>
+      </w:r>
+    </w:p>
+    <w:p>
+      <w:pPr>
+        <w:pStyle w:val="Normal"/>
+        <w:bidi w:val="0"/>
+        <w:jc w:val="left"/>
+        <w:rPr>
+          <w:lang w:val="es-MX"/>
+        </w:rPr>
+      </w:pPr>
+      <w:r>
+        <w:rPr>
+          <w:lang w:val="es-MX"/>
+        </w:rPr>
+        <w:t>Otro Ejemplo.</w:t>
+        <w:br/>
+        <w:br/>
+        <w:t>Vista local (Visual):</w:t>
+        <w:br/>
+        <w:t>*Hacer funcionar las notificacione.</w:t>
+      </w:r>
+    </w:p>
+    <w:p>
+      <w:pPr>
+        <w:pStyle w:val="Normal"/>
+        <w:bidi w:val="0"/>
+        <w:jc w:val="left"/>
+        <w:rPr>
+          <w:lang w:val="es-MX"/>
+        </w:rPr>
+      </w:pPr>
+      <w:r>
+        <w:rPr>
+          <w:lang w:val="es-MX"/>
+        </w:rPr>
+        <w:t>*Ajusta la inferzas con la informacion del local (No funciona el modo obscuro y se ve rara)</w:t>
+      </w:r>
+    </w:p>
+    <w:p>
+      <w:pPr>
+        <w:pStyle w:val="Normal"/>
+        <w:bidi w:val="0"/>
+        <w:jc w:val="left"/>
+        <w:rPr>
+          <w:lang w:val="es-MX"/>
+        </w:rPr>
+      </w:pPr>
+      <w:r>
+        <w:rPr>
+          <w:lang w:val="es-MX"/>
+        </w:rPr>
+        <w:t>*ajustar los botones de las categorias para que se vean mas esteticos.</w:t>
+        <w:br/>
+        <w:t>*Añadir que el usuario pueda modificar la informacion del producto al completo.</w:t>
+      </w:r>
+    </w:p>
+    <w:p>
+      <w:pPr>
+        <w:pStyle w:val="Normal"/>
+        <w:bidi w:val="0"/>
+        <w:jc w:val="left"/>
+        <w:rPr>
+          <w:lang w:val="es-MX"/>
+        </w:rPr>
+      </w:pPr>
+      <w:r>
+        <w:rPr>
+          <w:lang w:val="es-MX"/>
+        </w:rPr>
+        <w:t>*permitir que el usuario pueda modificar el monto de la oferta</w:t>
+      </w:r>
+    </w:p>
+    <w:p>
+      <w:pPr>
+        <w:pStyle w:val="Normal"/>
+        <w:bidi w:val="0"/>
+        <w:jc w:val="left"/>
+        <w:rPr>
+          <w:lang w:val="es-MX"/>
+        </w:rPr>
+      </w:pPr>
+      <w:r>
+        <w:rPr>
+          <w:lang w:val="es-MX"/>
+        </w:rPr>
+      </w:r>
+    </w:p>
+    <w:p>
+      <w:pPr>
+        <w:pStyle w:val="Normal"/>
+        <w:bidi w:val="0"/>
+        <w:jc w:val="left"/>
+        <w:rPr>
+          <w:lang w:val="es-MX"/>
+        </w:rPr>
+      </w:pPr>
+      <w:r>
+        <w:rPr>
+          <w:lang w:val="es-MX"/>
+        </w:rPr>
+        <w:t>Vista Admin (visual):</w:t>
+        <w:br/>
+        <w:t>*arreglar la vista grupos</w:t>
+      </w:r>
+    </w:p>
+    <w:p>
+      <w:pPr>
+        <w:pStyle w:val="Normal"/>
+        <w:bidi w:val="0"/>
+        <w:jc w:val="left"/>
+        <w:rPr>
+          <w:lang w:val="es-MX"/>
+        </w:rPr>
+      </w:pPr>
+      <w:r>
+        <w:rPr>
+          <w:lang w:val="es-MX"/>
+        </w:rPr>
+      </w:r>
+    </w:p>
+    <w:p>
+      <w:pPr>
+        <w:pStyle w:val="Normal"/>
+        <w:bidi w:val="0"/>
+        <w:jc w:val="left"/>
+        <w:rPr>
+          <w:lang w:val="es-MX"/>
+        </w:rPr>
+      </w:pPr>
+      <w:r>
+        <w:rPr>
+          <w:lang w:val="es-MX"/>
+        </w:rPr>
+      </w:r>
+    </w:p>
+    <w:p>
+      <w:pPr>
+        <w:pStyle w:val="Normal"/>
+        <w:bidi w:val="0"/>
+        <w:jc w:val="left"/>
+        <w:rPr>
+          <w:lang w:val="es-MX"/>
+        </w:rPr>
+      </w:pPr>
+      <w:r>
+        <w:rPr>
+          <w:lang w:val="es-MX"/>
+        </w:rPr>
+      </w:r>
+    </w:p>
+    <w:p>
+      <w:pPr>
+        <w:pStyle w:val="Normal"/>
+        <w:bidi w:val="0"/>
+        <w:jc w:val="left"/>
+        <w:rPr>
+          <w:lang w:val="es-MX"/>
+        </w:rPr>
+      </w:pPr>
+      <w:r>
+        <w:rPr>
+          <w:lang w:val="es-MX"/>
+        </w:rPr>
+      </w:r>
+    </w:p>
+    <w:p>
+      <w:pPr>
+        <w:pStyle w:val="Normal"/>
+        <w:bidi w:val="0"/>
+        <w:jc w:val="left"/>
+        <w:rPr>
+          <w:lang w:val="es-MX"/>
+        </w:rPr>
+      </w:pPr>
+      <w:r>
+        <w:rPr>
+          <w:lang w:val="es-MX"/>
+        </w:rPr>
+      </w:r>
+    </w:p>
+    <w:p>
+      <w:pPr>
+        <w:pStyle w:val="Normal"/>
+        <w:bidi w:val="0"/>
+        <w:jc w:val="left"/>
+        <w:rPr>
+          <w:lang w:val="es-MX"/>
+        </w:rPr>
+      </w:pPr>
+      <w:r>
+        <w:rPr>
+          <w:lang w:val="es-MX"/>
+        </w:rPr>
+        <w:t>BD Funcionalidades del Backend que faltan :</w:t>
+        <w:br/>
       </w:r>
     </w:p>
     <w:p>
@@ -139,53 +936,28 @@
       </w:pPr>
       <w:r>
         <w:rPr/>
-        <w:t>Implementar la compatibilidad de las motos al registro de productos</w:t>
-      </w:r>
-    </w:p>
-    <w:p>
-      <w:pPr>
-        <w:pStyle w:val="Normal"/>
-        <w:bidi w:val="0"/>
-        <w:jc w:val="left"/>
-        <w:rPr/>
-      </w:pPr>
-      <w:r>
-        <w:rPr/>
-      </w:r>
-    </w:p>
-    <w:p>
-      <w:pPr>
-        <w:pStyle w:val="Normal"/>
-        <w:bidi w:val="0"/>
-        <w:jc w:val="left"/>
-        <w:rPr/>
-      </w:pPr>
-      <w:r>
-        <w:rPr/>
-        <w:t>Acomodar las comunidades de moteros para que funcione como los grupos en facebook</w:t>
-      </w:r>
-    </w:p>
-    <w:p>
-      <w:pPr>
-        <w:pStyle w:val="Normal"/>
-        <w:bidi w:val="0"/>
-        <w:jc w:val="left"/>
-        <w:rPr/>
-      </w:pPr>
-      <w:r>
-        <w:rPr/>
-      </w:r>
-    </w:p>
-    <w:p>
-      <w:pPr>
-        <w:pStyle w:val="Normal"/>
-        <w:bidi w:val="0"/>
-        <w:jc w:val="left"/>
-        <w:rPr/>
-      </w:pPr>
-      <w:r>
-        <w:rPr/>
-        <w:t>implementar los cursos para que se puedan registrar desde la vista admin, aunque no haya contenido.</w:t>
+      </w:r>
+    </w:p>
+    <w:p>
+      <w:pPr>
+        <w:pStyle w:val="Normal"/>
+        <w:bidi w:val="0"/>
+        <w:jc w:val="left"/>
+        <w:rPr/>
+      </w:pPr>
+      <w:r>
+        <w:rPr/>
+      </w:r>
+    </w:p>
+    <w:p>
+      <w:pPr>
+        <w:pStyle w:val="Normal"/>
+        <w:bidi w:val="0"/>
+        <w:jc w:val="left"/>
+        <w:rPr/>
+      </w:pPr>
+      <w:r>
+        <w:rPr/>
       </w:r>
     </w:p>
     <w:p>
@@ -231,92 +1003,73 @@
       </w:pPr>
       <w:r>
         <w:rPr/>
-        <w:t>Corregir la vista admin para que puede operar correctamente (hacer  la plantilla),</w:t>
+      </w:r>
+    </w:p>
+    <w:p>
+      <w:pPr>
+        <w:pStyle w:val="Normal"/>
+        <w:bidi w:val="0"/>
+        <w:jc w:val="left"/>
+        <w:rPr/>
+      </w:pPr>
+      <w:r>
+        <w:rPr/>
+      </w:r>
+    </w:p>
+    <w:p>
+      <w:pPr>
+        <w:pStyle w:val="Normal"/>
+        <w:bidi w:val="0"/>
+        <w:jc w:val="left"/>
+        <w:rPr/>
+      </w:pPr>
+      <w:r>
+        <w:rPr/>
+      </w:r>
+    </w:p>
+    <w:p>
+      <w:pPr>
+        <w:pStyle w:val="Normal"/>
+        <w:bidi w:val="0"/>
+        <w:jc w:val="left"/>
+        <w:rPr/>
+      </w:pPr>
+      <w:r>
+        <w:rPr/>
+      </w:r>
+    </w:p>
+    <w:p>
+      <w:pPr>
+        <w:pStyle w:val="Normal"/>
+        <w:bidi w:val="0"/>
+        <w:jc w:val="left"/>
+        <w:rPr>
+          <w:lang w:val="es-MX"/>
+        </w:rPr>
+      </w:pPr>
+      <w:r>
+        <w:rPr>
+          <w:lang w:val="es-MX"/>
+        </w:rPr>
+        <w:t>*agregar el sistema de pagos</w:t>
         <w:br/>
-        <w:t>Pestañas:</w:t>
-      </w:r>
-    </w:p>
-    <w:p>
-      <w:pPr>
-        <w:pStyle w:val="Normal"/>
-        <w:bidi w:val="0"/>
-        <w:jc w:val="left"/>
-        <w:rPr/>
-      </w:pPr>
-      <w:r>
-        <w:rPr/>
-      </w:r>
-    </w:p>
-    <w:p>
-      <w:pPr>
-        <w:pStyle w:val="Normal"/>
-        <w:bidi w:val="0"/>
-        <w:jc w:val="left"/>
-        <w:rPr/>
-      </w:pPr>
-      <w:r>
-        <w:rPr/>
-        <w:t>*Inicio: Panel de control y estadisticas</w:t>
-      </w:r>
-    </w:p>
-    <w:p>
-      <w:pPr>
-        <w:pStyle w:val="Normal"/>
-        <w:bidi w:val="0"/>
-        <w:jc w:val="left"/>
-        <w:rPr/>
-      </w:pPr>
-      <w:r>
-        <w:rPr/>
-        <w:t>*Mapa Global: con la ubicación de los locales registrados</w:t>
-      </w:r>
-    </w:p>
-    <w:p>
-      <w:pPr>
-        <w:pStyle w:val="Normal"/>
-        <w:bidi w:val="0"/>
-        <w:jc w:val="left"/>
-        <w:rPr/>
-      </w:pPr>
-      <w:r>
-        <w:rPr/>
-        <w:t>*Gestion de Usuarios: CRUD completo. : Nombres de usuarios, correos, Rol, bloquear,cambiar rol, desbloquear, membresia.</w:t>
-      </w:r>
-    </w:p>
-    <w:p>
-      <w:pPr>
-        <w:pStyle w:val="Normal"/>
-        <w:bidi w:val="0"/>
-        <w:jc w:val="left"/>
-        <w:rPr/>
-      </w:pPr>
-      <w:r>
-        <w:rPr/>
-        <w:t>*Cursos: Aquí se ven los cursos (Nombre y foto), se habilitan o deshabilitan y modificar a la membresia que deben pertenecer.</w:t>
-      </w:r>
-    </w:p>
-    <w:p>
-      <w:pPr>
-        <w:pStyle w:val="Normal"/>
-        <w:bidi w:val="0"/>
-        <w:jc w:val="left"/>
-        <w:rPr/>
-      </w:pPr>
-      <w:r>
-        <w:rPr/>
-        <w:t>*Solicitudes de grupo: que aparezcan los datos de quien solicita y el nombre del grupo</w:t>
-      </w:r>
-    </w:p>
-    <w:p>
-      <w:pPr>
-        <w:pStyle w:val="Normal"/>
-        <w:bidi w:val="0"/>
-        <w:jc w:val="left"/>
-        <w:rPr/>
-      </w:pPr>
-      <w:r>
-        <w:rPr/>
-        <w:t>*Registro De pagos: Aqui hay que ver como hacemos si con nombre de usuario y un check o confirmar el pago con un boton.</w:t>
+        <w:t>*verificar los registros</w:t>
+      </w:r>
+    </w:p>
+    <w:p>
+      <w:pPr>
+        <w:pStyle w:val="Normal"/>
+        <w:bidi w:val="0"/>
+        <w:jc w:val="left"/>
+        <w:rPr>
+          <w:lang w:val="es-MX"/>
+        </w:rPr>
+      </w:pPr>
+      <w:r>
+        <w:rPr>
+          <w:lang w:val="es-MX"/>
+        </w:rPr>
+        <w:t>*Agregar el manejo de imagenes</w:t>
       </w:r>
     </w:p>
     <w:p>
@@ -340,6 +1093,119 @@
       <w:r>
         <w:rPr/>
         <w:t>Ajustar que todos los campos y registro de productos concuerden con la BD</w:t>
+      </w:r>
+    </w:p>
+    <w:p>
+      <w:pPr>
+        <w:pStyle w:val="Normal"/>
+        <w:bidi w:val="0"/>
+        <w:jc w:val="left"/>
+        <w:rPr/>
+      </w:pPr>
+      <w:r>
+        <w:rPr/>
+      </w:r>
+    </w:p>
+    <w:p>
+      <w:pPr>
+        <w:pStyle w:val="Normal"/>
+        <w:bidi w:val="0"/>
+        <w:jc w:val="left"/>
+        <w:rPr/>
+      </w:pPr>
+      <w:r>
+        <w:rPr/>
+      </w:r>
+    </w:p>
+    <w:p>
+      <w:pPr>
+        <w:pStyle w:val="Normal"/>
+        <w:bidi w:val="0"/>
+        <w:jc w:val="left"/>
+        <w:rPr/>
+      </w:pPr>
+      <w:r>
+        <w:rPr/>
+        <w:t>Darle funcionalidad al boton de promociones y limitar visibilidad según el rol del usuario.</w:t>
+      </w:r>
+    </w:p>
+    <w:p>
+      <w:pPr>
+        <w:pStyle w:val="Normal"/>
+        <w:bidi w:val="0"/>
+        <w:jc w:val="left"/>
+        <w:rPr/>
+      </w:pPr>
+      <w:r>
+        <w:rPr/>
+      </w:r>
+    </w:p>
+    <w:p>
+      <w:pPr>
+        <w:pStyle w:val="Normal"/>
+        <w:bidi w:val="0"/>
+        <w:jc w:val="left"/>
+        <w:rPr/>
+      </w:pPr>
+      <w:r>
+        <w:rPr/>
+        <w:t>Ajustar todo el sistema de grupos.</w:t>
+      </w:r>
+    </w:p>
+    <w:p>
+      <w:pPr>
+        <w:pStyle w:val="Normal"/>
+        <w:bidi w:val="0"/>
+        <w:jc w:val="left"/>
+        <w:rPr/>
+      </w:pPr>
+      <w:r>
+        <w:rPr/>
+      </w:r>
+    </w:p>
+    <w:p>
+      <w:pPr>
+        <w:pStyle w:val="Normal"/>
+        <w:bidi w:val="0"/>
+        <w:jc w:val="left"/>
+        <w:rPr>
+          <w:lang w:val="es-MX"/>
+        </w:rPr>
+      </w:pPr>
+      <w:r>
+        <w:rPr>
+          <w:lang w:val="es-MX"/>
+        </w:rPr>
+        <w:t>Vista admind (Funcional):</w:t>
+        <w:br/>
+        <w:t>Hacer consulta para ver grupos registrados.</w:t>
+      </w:r>
+    </w:p>
+    <w:p>
+      <w:pPr>
+        <w:pStyle w:val="Normal"/>
+        <w:bidi w:val="0"/>
+        <w:jc w:val="left"/>
+        <w:rPr>
+          <w:lang w:val="es-MX"/>
+        </w:rPr>
+      </w:pPr>
+      <w:r>
+        <w:rPr>
+          <w:lang w:val="es-MX"/>
+        </w:rPr>
+        <w:t>Ajustar el como se ven los cursos.</w:t>
+      </w:r>
+    </w:p>
+    <w:p>
+      <w:pPr>
+        <w:pStyle w:val="Normal"/>
+        <w:bidi w:val="0"/>
+        <w:jc w:val="left"/>
+        <w:rPr/>
+      </w:pPr>
+      <w:r>
+        <w:rPr/>
       </w:r>
     </w:p>
     <w:p>
@@ -479,7 +1345,7 @@
     <w:pPr>
       <w:widowControl/>
       <w:suppressAutoHyphens w:val="true"/>
-      <w:overflowPunct w:val="false"/>
+      <w:overflowPunct w:val="true"/>
       <w:bidi w:val="0"/>
       <w:spacing w:before="0" w:after="0"/>
       <w:jc w:val="left"/>
@@ -491,6 +1357,14 @@
       <w:sz w:val="24"/>
       <w:szCs w:val="24"/>
       <w:lang w:val="es-VE" w:eastAsia="zh-CN" w:bidi="hi-IN"/>
+    </w:rPr>
+  </w:style>
+  <w:style w:type="character" w:styleId="Strong">
+    <w:name w:val="Strong"/>
+    <w:qFormat/>
+    <w:rPr>
+      <w:b/>
+      <w:bCs/>
     </w:rPr>
   </w:style>
   <w:style w:type="paragraph" w:styleId="Ttulo">

</xml_diff>